<commit_message>
Fixed a subheading by removing it
</commit_message>
<xml_diff>
--- a/Output/report.docx
+++ b/Output/report.docx
@@ -969,9 +969,6 @@
         <w:t xml:space="preserve">On October 3rd, 2024, at approximately 14:32 UTC, XDR logs recorded suspicious activity originating from a laptop (</w:t>
       </w:r>
       <w:r>
-        <w:rPr>
-          <w:rStyle w:val="VerbatimChar"/>
-        </w:rPr>
         <w:t xml:space="preserve">LAPTOP-E5SFX3</w:t>
       </w:r>
       <w:r>
@@ -981,9 +978,6 @@
         <w:t xml:space="preserve"> </w:t>
       </w:r>
       <w:r>
-        <w:rPr>
-          <w:rStyle w:val="VerbatimChar"/>
-        </w:rPr>
         <w:t xml:space="preserve">update.exe</w:t>
       </w:r>
       <w:r>
@@ -993,9 +987,6 @@
         <w:t xml:space="preserve">being run from an uncommon directory (</w:t>
       </w:r>
       <w:r>
-        <w:rPr>
-          <w:rStyle w:val="VerbatimChar"/>
-        </w:rPr>
         <w:t xml:space="preserve">C:\Users[username]\AppData\Roaming\Temp</w:t>
       </w:r>
       <w:r>
@@ -1045,9 +1036,6 @@
         <w:t xml:space="preserve"> </w:t>
       </w:r>
       <w:r>
-        <w:rPr>
-          <w:rStyle w:val="VerbatimChar"/>
-        </w:rPr>
         <w:t xml:space="preserve">update.exe</w:t>
       </w:r>
       <w:r>
@@ -1976,9 +1964,6 @@
               <w:t xml:space="preserve"> </w:t>
             </w:r>
             <w:r>
-              <w:rPr>
-                <w:rStyle w:val="VerbatimChar"/>
-              </w:rPr>
               <w:t xml:space="preserve">admin01</w:t>
             </w:r>
             <w:r>
@@ -2429,9 +2414,6 @@
         <w:t xml:space="preserve"> </w:t>
       </w:r>
       <w:r>
-        <w:rPr>
-          <w:rStyle w:val="VerbatimChar"/>
-        </w:rPr>
         <w:t xml:space="preserve">usernames</w:t>
       </w:r>
       <w:r>
@@ -2441,9 +2423,6 @@
         <w:t xml:space="preserve"> </w:t>
       </w:r>
       <w:r>
-        <w:rPr>
-          <w:rStyle w:val="VerbatimChar"/>
-        </w:rPr>
         <w:t xml:space="preserve">servernames</w:t>
       </w:r>
       <w:r>
@@ -2453,9 +2432,6 @@
         <w:t xml:space="preserve"> </w:t>
       </w:r>
       <w:r>
-        <w:rPr>
-          <w:rStyle w:val="VerbatimChar"/>
-        </w:rPr>
         <w:t xml:space="preserve">ip addresses</w:t>
       </w:r>
       <w:r>
@@ -2468,9 +2444,6 @@
         <w:t xml:space="preserve"> </w:t>
       </w:r>
       <w:r>
-        <w:rPr>
-          <w:rStyle w:val="VerbatimChar"/>
-        </w:rPr>
         <w:t xml:space="preserve">software</w:t>
       </w:r>
       <w:r>
@@ -2680,9 +2653,6 @@
         <w:t xml:space="preserve"> </w:t>
       </w:r>
       <w:r>
-        <w:rPr>
-          <w:rStyle w:val="VerbatimChar"/>
-        </w:rPr>
         <w:t xml:space="preserve">dummyfile 2.bin</w:t>
       </w:r>
       <w:r>
@@ -2702,9 +2672,6 @@
         <w:t xml:space="preserve"> </w:t>
       </w:r>
       <w:r>
-        <w:rPr>
-          <w:rStyle w:val="VerbatimChar"/>
-        </w:rPr>
         <w:t xml:space="preserve">16384</w:t>
       </w:r>
       <w:r>
@@ -2724,9 +2691,6 @@
         <w:t xml:space="preserve"> </w:t>
       </w:r>
       <w:r>
-        <w:rPr>
-          <w:rStyle w:val="VerbatimChar"/>
-        </w:rPr>
         <w:t xml:space="preserve">d2813820ecbacd8476cd4a961a8dd86300183008339e0add508cd219a1afac15</w:t>
       </w:r>
     </w:p>
@@ -2748,9 +2712,6 @@
         <w:t xml:space="preserve"> </w:t>
       </w:r>
       <w:r>
-        <w:rPr>
-          <w:rStyle w:val="VerbatimChar"/>
-        </w:rPr>
         <w:t xml:space="preserve">dummyfile 3.bin</w:t>
       </w:r>
       <w:r>
@@ -2770,9 +2731,6 @@
         <w:t xml:space="preserve"> </w:t>
       </w:r>
       <w:r>
-        <w:rPr>
-          <w:rStyle w:val="VerbatimChar"/>
-        </w:rPr>
         <w:t xml:space="preserve">15984</w:t>
       </w:r>
       <w:r>
@@ -2792,9 +2750,6 @@
         <w:t xml:space="preserve"> </w:t>
       </w:r>
       <w:r>
-        <w:rPr>
-          <w:rStyle w:val="VerbatimChar"/>
-        </w:rPr>
         <w:t xml:space="preserve">83c48c0b37029f76c07243a95d8e054a1b32722fd78e75b51810fb9a0ce7b98d</w:t>
       </w:r>
     </w:p>
@@ -2816,9 +2771,6 @@
         <w:t xml:space="preserve"> </w:t>
       </w:r>
       <w:r>
-        <w:rPr>
-          <w:rStyle w:val="VerbatimChar"/>
-        </w:rPr>
         <w:t xml:space="preserve">dummyfile.bin</w:t>
       </w:r>
       <w:r>
@@ -2838,9 +2790,6 @@
         <w:t xml:space="preserve"> </w:t>
       </w:r>
       <w:r>
-        <w:rPr>
-          <w:rStyle w:val="VerbatimChar"/>
-        </w:rPr>
         <w:t xml:space="preserve">16384</w:t>
       </w:r>
       <w:r>
@@ -2860,9 +2809,6 @@
         <w:t xml:space="preserve"> </w:t>
       </w:r>
       <w:r>
-        <w:rPr>
-          <w:rStyle w:val="VerbatimChar"/>
-        </w:rPr>
         <w:t xml:space="preserve">85b339ef3903c83d59deb070df1fd2245edc79b9fc4fc432996ddf2c6568e2f6</w:t>
       </w:r>
     </w:p>

</xml_diff>